<commit_message>
re run cookie and session
</commit_message>
<xml_diff>
--- a/2-NodeJs/Express.docx
+++ b/2-NodeJs/Express.docx
@@ -448,25 +448,7 @@
           <w:szCs w:val="32"/>
           <w:lang w:val="en-US"/>
         </w:rPr>
-        <w:t xml:space="preserve">then in file </w:t>
-      </w:r>
-      <w:r>
-        <w:rPr>
-          <w:rFonts w:ascii="Andale Mono" w:hAnsi="Andale Mono" w:cs="Browallia New"/>
-          <w:sz w:val="32"/>
-          <w:szCs w:val="32"/>
-          <w:lang w:val="en-US"/>
-        </w:rPr>
-        <w:t>userRoute</w:t>
-      </w:r>
-      <w:r>
-        <w:rPr>
-          <w:rFonts w:ascii="Andale Mono" w:hAnsi="Andale Mono" w:cs="Browallia New"/>
-          <w:sz w:val="32"/>
-          <w:szCs w:val="32"/>
-          <w:lang w:val="en-US"/>
-        </w:rPr>
-        <w:t xml:space="preserve"> will be</w:t>
+        <w:t>then in file userRoute will be</w:t>
       </w:r>
     </w:p>
     <w:p>
@@ -611,6 +593,7 @@
       <w:r>
         <w:rPr>
           <w:rFonts w:ascii="Andale Mono" w:hAnsi="Andale Mono" w:cs="Browallia New"/>
+          <w:noProof/>
           <w:sz w:val="32"/>
           <w:szCs w:val="32"/>
           <w:lang w:val="en-US"/>
@@ -1078,17 +1061,7 @@
           <w:highlight w:val="green"/>
           <w:lang w:val="en-US"/>
         </w:rPr>
-        <w:t xml:space="preserve"> cookie from </w:t>
-      </w:r>
-      <w:r>
-        <w:rPr>
-          <w:rFonts w:ascii="Andale Mono" w:hAnsi="Andale Mono" w:cs="Browallia New"/>
-          <w:sz w:val="32"/>
-          <w:szCs w:val="32"/>
-          <w:highlight w:val="green"/>
-          <w:lang w:val="en-US"/>
-        </w:rPr>
-        <w:t>Cookie-parser</w:t>
+        <w:t xml:space="preserve"> cookie from Cookie-parser</w:t>
       </w:r>
     </w:p>
     <w:p>
@@ -2012,6 +1985,7 @@
       <w:r>
         <w:rPr>
           <w:rFonts w:ascii="Andale Mono" w:hAnsi="Andale Mono" w:cs="Browallia New"/>
+          <w:noProof/>
           <w:sz w:val="32"/>
           <w:szCs w:val="32"/>
           <w:lang w:val="en-US"/>
@@ -2090,6 +2064,7 @@
       </w:pPr>
       <w:r>
         <w:rPr>
+          <w:noProof/>
           <w:lang w:val="en-US"/>
         </w:rPr>
         <w:drawing>

</xml_diff>